<commit_message>
Use old yahoo email
</commit_message>
<xml_diff>
--- a/Resume.docx
+++ b/Resume.docx
@@ -80,7 +80,25 @@
           <w:color w:themeColor="background1" w:themeShade="80" w:val="808080"/>
           <w:u w:val="none"/>
         </w:rPr>
-        <w:t xml:space="preserve"> agupta40@charlotte.edu         </w:t>
+        <w:t xml:space="preserve"> </w:t>
+      </w:r>
+      <w:r>
+        <w:rPr>
+          <w:rStyle w:val="Hyperlink"/>
+          <w:rFonts w:cs="Arial" w:ascii="Arial" w:hAnsi="Arial"/>
+          <w:color w:themeColor="background1" w:themeShade="80" w:val="808080"/>
+          <w:u w:val="none"/>
+        </w:rPr>
+        <w:t>gupta.aryan@yahoo.com</w:t>
+      </w:r>
+      <w:r>
+        <w:rPr>
+          <w:rStyle w:val="Hyperlink"/>
+          <w:rFonts w:cs="Arial" w:ascii="Arial" w:hAnsi="Arial"/>
+          <w:color w:themeColor="background1" w:themeShade="80" w:val="808080"/>
+          <w:u w:val="none"/>
+        </w:rPr>
+        <w:t xml:space="preserve">         </w:t>
       </w:r>
       <w:r>
         <w:rPr>
@@ -208,23 +226,7 @@
         </w:rPr>
         <w:t>M.S. in Computer Engineering</w:t>
         <w:tab/>
-        <w:t xml:space="preserve">Aug. 2020 – </w:t>
-      </w:r>
-      <w:r>
-        <w:rPr>
-          <w:rFonts w:cs="Arial" w:ascii="Arial" w:hAnsi="Arial"/>
-          <w:i/>
-          <w:sz w:val="20"/>
-        </w:rPr>
-        <w:t>Dec.</w:t>
-      </w:r>
-      <w:r>
-        <w:rPr>
-          <w:rFonts w:cs="Arial" w:ascii="Arial" w:hAnsi="Arial"/>
-          <w:i/>
-          <w:sz w:val="20"/>
-        </w:rPr>
-        <w:t xml:space="preserve"> 202</w:t>
+        <w:t>Aug. 2020 – Dec. 202</w:t>
       </w:r>
       <w:bookmarkStart w:id="1" w:name="_GoBack"/>
       <w:bookmarkEnd w:id="1"/>
@@ -234,15 +236,7 @@
           <w:i/>
           <w:sz w:val="20"/>
         </w:rPr>
-        <w:t>6</w:t>
-      </w:r>
-      <w:r>
-        <w:rPr>
-          <w:rFonts w:cs="Arial" w:ascii="Arial" w:hAnsi="Arial"/>
-          <w:i/>
-          <w:sz w:val="20"/>
-        </w:rPr>
-        <w:t xml:space="preserve"> (Expected)</w:t>
+        <w:t>6 (Expected)</w:t>
       </w:r>
     </w:p>
     <w:p>
@@ -290,8 +284,8 @@
       </w:tblPr>
       <w:tblGrid>
         <w:gridCol w:w="2970"/>
-        <w:gridCol w:w="2699"/>
-        <w:gridCol w:w="2606"/>
+        <w:gridCol w:w="2698"/>
+        <w:gridCol w:w="2607"/>
         <w:gridCol w:w="2908"/>
       </w:tblGrid>
       <w:tr>
@@ -310,6 +304,7 @@
             <w:pPr>
               <w:pStyle w:val="Normal"/>
               <w:widowControl/>
+              <w:suppressAutoHyphens w:val="true"/>
               <w:spacing w:lineRule="auto" w:line="276" w:before="0" w:after="0"/>
               <w:jc w:val="start"/>
               <w:rPr>
@@ -333,7 +328,7 @@
         </w:tc>
         <w:tc>
           <w:tcPr>
-            <w:tcW w:w="2699" w:type="dxa"/>
+            <w:tcW w:w="2698" w:type="dxa"/>
             <w:tcBorders>
               <w:top w:val="nil"/>
               <w:start w:val="nil"/>
@@ -345,6 +340,7 @@
             <w:pPr>
               <w:pStyle w:val="Normal"/>
               <w:widowControl/>
+              <w:suppressAutoHyphens w:val="true"/>
               <w:spacing w:lineRule="auto" w:line="276" w:before="0" w:after="0"/>
               <w:jc w:val="start"/>
               <w:rPr>
@@ -368,7 +364,7 @@
         </w:tc>
         <w:tc>
           <w:tcPr>
-            <w:tcW w:w="2606" w:type="dxa"/>
+            <w:tcW w:w="2607" w:type="dxa"/>
             <w:tcBorders>
               <w:top w:val="nil"/>
               <w:start w:val="nil"/>
@@ -380,6 +376,7 @@
             <w:pPr>
               <w:pStyle w:val="Normal"/>
               <w:widowControl/>
+              <w:suppressAutoHyphens w:val="true"/>
               <w:spacing w:lineRule="auto" w:line="276" w:before="0" w:after="0"/>
               <w:jc w:val="start"/>
               <w:rPr>
@@ -415,6 +412,7 @@
             <w:pPr>
               <w:pStyle w:val="Normal"/>
               <w:widowControl/>
+              <w:suppressAutoHyphens w:val="true"/>
               <w:spacing w:lineRule="auto" w:line="276" w:before="0" w:after="0"/>
               <w:jc w:val="end"/>
               <w:rPr>
@@ -546,57 +544,7 @@
         </w:rPr>
         <w:t>Software Engineer</w:t>
         <w:tab/>
-        <w:t>Aug. 202</w:t>
-      </w:r>
-      <w:r>
-        <w:rPr>
-          <w:rFonts w:cs="Arial" w:ascii="Arial" w:hAnsi="Arial"/>
-          <w:i/>
-          <w:iCs/>
-          <w:sz w:val="20"/>
-          <w:szCs w:val="20"/>
-        </w:rPr>
-        <w:t>5</w:t>
-      </w:r>
-      <w:r>
-        <w:rPr>
-          <w:rFonts w:cs="Arial" w:ascii="Arial" w:hAnsi="Arial"/>
-          <w:i/>
-          <w:iCs/>
-          <w:sz w:val="20"/>
-          <w:szCs w:val="20"/>
-        </w:rPr>
-        <w:t xml:space="preserve"> – </w:t>
-      </w:r>
-      <w:r>
-        <w:rPr>
-          <w:rFonts w:cs="Arial" w:ascii="Arial" w:hAnsi="Arial"/>
-          <w:i/>
-          <w:iCs/>
-          <w:sz w:val="20"/>
-          <w:szCs w:val="20"/>
-        </w:rPr>
-        <w:t>Aug.</w:t>
-      </w:r>
-      <w:r>
-        <w:rPr>
-          <w:rFonts w:cs="Arial" w:ascii="Arial" w:hAnsi="Arial"/>
-          <w:i/>
-          <w:iCs/>
-          <w:sz w:val="20"/>
-          <w:szCs w:val="20"/>
-        </w:rPr>
-        <w:t xml:space="preserve"> 202</w:t>
-      </w:r>
-      <w:r>
-        <w:rPr>
-          <w:rFonts w:cs="Arial" w:ascii="Arial" w:hAnsi="Arial"/>
-          <w:i/>
-          <w:iCs/>
-          <w:sz w:val="20"/>
-          <w:szCs w:val="20"/>
-        </w:rPr>
-        <w:t>6</w:t>
+        <w:t>Aug. 2025 – Aug. 2026</w:t>
       </w:r>
     </w:p>
     <w:p>
@@ -657,15 +605,7 @@
           <w:sz w:val="20"/>
           <w:szCs w:val="20"/>
         </w:rPr>
-        <w:t xml:space="preserve">Utilize </w:t>
-      </w:r>
-      <w:r>
-        <w:rPr>
-          <w:rFonts w:cs="Arial" w:ascii="Arial" w:hAnsi="Arial"/>
-          <w:sz w:val="20"/>
-          <w:szCs w:val="20"/>
-        </w:rPr>
-        <w:t>Java, AI LLMs, OpenShift containers, Linux, git, Sonar, and Harness pipeline to support code base</w:t>
+        <w:t>Utilize Java, AI LLMs, OpenShift containers, Linux, git, Sonar, and Harness pipeline to support code base</w:t>
       </w:r>
     </w:p>
     <w:p>
@@ -1078,13 +1018,6 @@
           <w:iCs/>
         </w:rPr>
         <w:tab/>
-      </w:r>
-      <w:r>
-        <w:rPr>
-          <w:rFonts w:cs="Arial" w:ascii="Arial" w:hAnsi="Arial"/>
-          <w:i/>
-          <w:iCs/>
-        </w:rPr>
         <w:t>Dec. 2026</w:t>
       </w:r>
     </w:p>
@@ -1648,8 +1581,8 @@
         <w:tblLook w:val="04a0" w:noHBand="0" w:noVBand="1" w:firstColumn="1" w:lastRow="0" w:lastColumn="0" w:firstRow="1"/>
       </w:tblPr>
       <w:tblGrid>
-        <w:gridCol w:w="1592"/>
-        <w:gridCol w:w="2081"/>
+        <w:gridCol w:w="1591"/>
+        <w:gridCol w:w="2082"/>
         <w:gridCol w:w="2104"/>
         <w:gridCol w:w="2032"/>
         <w:gridCol w:w="2559"/>
@@ -1658,7 +1591,7 @@
         <w:trPr/>
         <w:tc>
           <w:tcPr>
-            <w:tcW w:w="1592" w:type="dxa"/>
+            <w:tcW w:w="1591" w:type="dxa"/>
             <w:tcBorders>
               <w:top w:val="nil"/>
               <w:start w:val="nil"/>
@@ -1670,6 +1603,7 @@
             <w:pPr>
               <w:pStyle w:val="Normal"/>
               <w:widowControl/>
+              <w:suppressAutoHyphens w:val="true"/>
               <w:spacing w:lineRule="auto" w:line="240" w:before="0" w:after="0"/>
               <w:jc w:val="start"/>
               <w:rPr>
@@ -1690,7 +1624,7 @@
         </w:tc>
         <w:tc>
           <w:tcPr>
-            <w:tcW w:w="2081" w:type="dxa"/>
+            <w:tcW w:w="2082" w:type="dxa"/>
             <w:tcBorders>
               <w:top w:val="nil"/>
               <w:start w:val="nil"/>
@@ -1702,6 +1636,7 @@
             <w:pPr>
               <w:pStyle w:val="Normal"/>
               <w:widowControl/>
+              <w:suppressAutoHyphens w:val="true"/>
               <w:spacing w:lineRule="auto" w:line="240" w:before="0" w:after="0"/>
               <w:jc w:val="start"/>
               <w:rPr>
@@ -1734,6 +1669,7 @@
             <w:pPr>
               <w:pStyle w:val="Normal"/>
               <w:widowControl/>
+              <w:suppressAutoHyphens w:val="true"/>
               <w:spacing w:lineRule="auto" w:line="240" w:before="0" w:after="0"/>
               <w:jc w:val="start"/>
               <w:rPr>
@@ -1766,6 +1702,7 @@
             <w:pPr>
               <w:pStyle w:val="Normal"/>
               <w:widowControl/>
+              <w:suppressAutoHyphens w:val="true"/>
               <w:spacing w:lineRule="auto" w:line="240" w:before="0" w:after="0"/>
               <w:jc w:val="start"/>
               <w:rPr>
@@ -1798,6 +1735,7 @@
             <w:pPr>
               <w:pStyle w:val="Normal"/>
               <w:widowControl/>
+              <w:suppressAutoHyphens w:val="true"/>
               <w:spacing w:lineRule="auto" w:line="240" w:before="0" w:after="0"/>
               <w:jc w:val="start"/>
               <w:rPr>
@@ -1851,10 +1789,10 @@
       </w:tblPr>
       <w:tblGrid>
         <w:gridCol w:w="2632"/>
-        <w:gridCol w:w="1885"/>
-        <w:gridCol w:w="2474"/>
-        <w:gridCol w:w="1457"/>
-        <w:gridCol w:w="2278"/>
+        <w:gridCol w:w="1884"/>
+        <w:gridCol w:w="2475"/>
+        <w:gridCol w:w="1456"/>
+        <w:gridCol w:w="2279"/>
       </w:tblGrid>
       <w:tr>
         <w:trPr/>
@@ -1872,6 +1810,7 @@
             <w:pPr>
               <w:pStyle w:val="Normal"/>
               <w:widowControl/>
+              <w:suppressAutoHyphens w:val="true"/>
               <w:spacing w:lineRule="auto" w:line="240" w:before="0" w:after="0"/>
               <w:jc w:val="start"/>
               <w:rPr>
@@ -1892,7 +1831,7 @@
         </w:tc>
         <w:tc>
           <w:tcPr>
-            <w:tcW w:w="1885" w:type="dxa"/>
+            <w:tcW w:w="1884" w:type="dxa"/>
             <w:tcBorders>
               <w:top w:val="nil"/>
               <w:start w:val="nil"/>
@@ -1904,6 +1843,7 @@
             <w:pPr>
               <w:pStyle w:val="Normal"/>
               <w:widowControl/>
+              <w:suppressAutoHyphens w:val="true"/>
               <w:spacing w:lineRule="auto" w:line="240" w:before="0" w:after="0"/>
               <w:jc w:val="start"/>
               <w:rPr>
@@ -1924,7 +1864,7 @@
         </w:tc>
         <w:tc>
           <w:tcPr>
-            <w:tcW w:w="2474" w:type="dxa"/>
+            <w:tcW w:w="2475" w:type="dxa"/>
             <w:tcBorders>
               <w:top w:val="nil"/>
               <w:start w:val="nil"/>
@@ -1936,6 +1876,7 @@
             <w:pPr>
               <w:pStyle w:val="Normal"/>
               <w:widowControl/>
+              <w:suppressAutoHyphens w:val="true"/>
               <w:spacing w:lineRule="auto" w:line="240" w:before="0" w:after="0"/>
               <w:jc w:val="start"/>
               <w:rPr>
@@ -1956,7 +1897,7 @@
         </w:tc>
         <w:tc>
           <w:tcPr>
-            <w:tcW w:w="1457" w:type="dxa"/>
+            <w:tcW w:w="1456" w:type="dxa"/>
             <w:tcBorders>
               <w:top w:val="nil"/>
               <w:start w:val="nil"/>
@@ -1968,6 +1909,7 @@
             <w:pPr>
               <w:pStyle w:val="Normal"/>
               <w:widowControl/>
+              <w:suppressAutoHyphens w:val="true"/>
               <w:spacing w:lineRule="auto" w:line="240" w:before="0" w:after="0"/>
               <w:jc w:val="start"/>
               <w:rPr>
@@ -1988,7 +1930,7 @@
         </w:tc>
         <w:tc>
           <w:tcPr>
-            <w:tcW w:w="2278" w:type="dxa"/>
+            <w:tcW w:w="2279" w:type="dxa"/>
             <w:tcBorders>
               <w:top w:val="nil"/>
               <w:start w:val="nil"/>
@@ -2000,6 +1942,7 @@
             <w:pPr>
               <w:pStyle w:val="Normal"/>
               <w:widowControl/>
+              <w:suppressAutoHyphens w:val="true"/>
               <w:spacing w:lineRule="auto" w:line="240" w:before="0" w:after="0"/>
               <w:jc w:val="start"/>
               <w:rPr>
@@ -2054,13 +1997,13 @@
       <w:tblGrid>
         <w:gridCol w:w="920"/>
         <w:gridCol w:w="1189"/>
-        <w:gridCol w:w="1029"/>
-        <w:gridCol w:w="1227"/>
-        <w:gridCol w:w="785"/>
-        <w:gridCol w:w="1349"/>
+        <w:gridCol w:w="1028"/>
+        <w:gridCol w:w="1228"/>
+        <w:gridCol w:w="784"/>
+        <w:gridCol w:w="1350"/>
         <w:gridCol w:w="1544"/>
-        <w:gridCol w:w="992"/>
-        <w:gridCol w:w="970"/>
+        <w:gridCol w:w="991"/>
+        <w:gridCol w:w="971"/>
       </w:tblGrid>
       <w:tr>
         <w:trPr/>
@@ -2078,6 +2021,7 @@
             <w:pPr>
               <w:pStyle w:val="Normal"/>
               <w:widowControl/>
+              <w:suppressAutoHyphens w:val="true"/>
               <w:spacing w:lineRule="auto" w:line="240" w:before="0" w:after="0"/>
               <w:jc w:val="start"/>
               <w:rPr>
@@ -2110,6 +2054,7 @@
             <w:pPr>
               <w:pStyle w:val="Normal"/>
               <w:widowControl/>
+              <w:suppressAutoHyphens w:val="true"/>
               <w:spacing w:lineRule="auto" w:line="240" w:before="0" w:after="0"/>
               <w:jc w:val="start"/>
               <w:rPr>
@@ -2130,7 +2075,7 @@
         </w:tc>
         <w:tc>
           <w:tcPr>
-            <w:tcW w:w="1029" w:type="dxa"/>
+            <w:tcW w:w="1028" w:type="dxa"/>
             <w:tcBorders>
               <w:top w:val="nil"/>
               <w:start w:val="nil"/>
@@ -2142,6 +2087,7 @@
             <w:pPr>
               <w:pStyle w:val="Normal"/>
               <w:widowControl/>
+              <w:suppressAutoHyphens w:val="true"/>
               <w:spacing w:lineRule="auto" w:line="240" w:before="0" w:after="0"/>
               <w:jc w:val="start"/>
               <w:rPr>
@@ -2162,7 +2108,7 @@
         </w:tc>
         <w:tc>
           <w:tcPr>
-            <w:tcW w:w="1227" w:type="dxa"/>
+            <w:tcW w:w="1228" w:type="dxa"/>
             <w:tcBorders>
               <w:top w:val="nil"/>
               <w:start w:val="nil"/>
@@ -2174,6 +2120,7 @@
             <w:pPr>
               <w:pStyle w:val="Normal"/>
               <w:widowControl/>
+              <w:suppressAutoHyphens w:val="true"/>
               <w:spacing w:lineRule="auto" w:line="240" w:before="0" w:after="0"/>
               <w:jc w:val="start"/>
               <w:rPr>
@@ -2194,7 +2141,7 @@
         </w:tc>
         <w:tc>
           <w:tcPr>
-            <w:tcW w:w="785" w:type="dxa"/>
+            <w:tcW w:w="784" w:type="dxa"/>
             <w:tcBorders>
               <w:top w:val="nil"/>
               <w:start w:val="nil"/>
@@ -2206,6 +2153,7 @@
             <w:pPr>
               <w:pStyle w:val="Normal"/>
               <w:widowControl/>
+              <w:suppressAutoHyphens w:val="true"/>
               <w:spacing w:lineRule="auto" w:line="240" w:before="0" w:after="0"/>
               <w:jc w:val="start"/>
               <w:rPr>
@@ -2226,7 +2174,7 @@
         </w:tc>
         <w:tc>
           <w:tcPr>
-            <w:tcW w:w="1349" w:type="dxa"/>
+            <w:tcW w:w="1350" w:type="dxa"/>
             <w:tcBorders>
               <w:top w:val="nil"/>
               <w:start w:val="nil"/>
@@ -2238,6 +2186,7 @@
             <w:pPr>
               <w:pStyle w:val="Normal"/>
               <w:widowControl/>
+              <w:suppressAutoHyphens w:val="true"/>
               <w:spacing w:lineRule="auto" w:line="240" w:before="0" w:after="0"/>
               <w:jc w:val="start"/>
               <w:rPr>
@@ -2270,6 +2219,7 @@
             <w:pPr>
               <w:pStyle w:val="Normal"/>
               <w:widowControl/>
+              <w:suppressAutoHyphens w:val="true"/>
               <w:spacing w:lineRule="auto" w:line="240" w:before="0" w:after="0"/>
               <w:jc w:val="start"/>
               <w:rPr>
@@ -2290,7 +2240,7 @@
         </w:tc>
         <w:tc>
           <w:tcPr>
-            <w:tcW w:w="992" w:type="dxa"/>
+            <w:tcW w:w="991" w:type="dxa"/>
             <w:tcBorders>
               <w:top w:val="nil"/>
               <w:start w:val="nil"/>
@@ -2302,6 +2252,7 @@
             <w:pPr>
               <w:pStyle w:val="Normal"/>
               <w:widowControl/>
+              <w:suppressAutoHyphens w:val="true"/>
               <w:spacing w:lineRule="auto" w:line="240" w:before="0" w:after="0"/>
               <w:jc w:val="start"/>
               <w:rPr>
@@ -2322,7 +2273,7 @@
         </w:tc>
         <w:tc>
           <w:tcPr>
-            <w:tcW w:w="970" w:type="dxa"/>
+            <w:tcW w:w="971" w:type="dxa"/>
             <w:tcBorders>
               <w:top w:val="nil"/>
               <w:start w:val="nil"/>
@@ -2334,6 +2285,7 @@
             <w:pPr>
               <w:pStyle w:val="Normal"/>
               <w:widowControl/>
+              <w:suppressAutoHyphens w:val="true"/>
               <w:spacing w:lineRule="auto" w:line="240" w:before="0" w:after="0"/>
               <w:jc w:val="start"/>
               <w:rPr>
@@ -3779,6 +3731,7 @@
     <w:qFormat/>
     <w:pPr>
       <w:widowControl/>
+      <w:suppressAutoHyphens w:val="true"/>
       <w:bidi w:val="0"/>
       <w:spacing w:lineRule="auto" w:line="259" w:before="0" w:after="160"/>
       <w:jc w:val="start"/>
@@ -3869,14 +3822,21 @@
       <w:szCs w:val="20"/>
     </w:rPr>
   </w:style>
-  <w:style w:type="character" w:styleId="EndnoteCharacters">
-    <w:name w:val="Endnote Characters"/>
+  <w:style w:type="character" w:styleId="EndnoteCharactersuser">
+    <w:name w:val="Endnote Characters (user)"/>
     <w:basedOn w:val="DefaultParagraphFont"/>
     <w:uiPriority w:val="99"/>
     <w:semiHidden/>
     <w:unhideWhenUsed/>
     <w:qFormat/>
     <w:rsid w:val="00f7215c"/>
+    <w:rPr>
+      <w:vertAlign w:val="superscript"/>
+    </w:rPr>
+  </w:style>
+  <w:style w:type="character" w:styleId="EndnoteCharacters">
+    <w:name w:val="Endnote Characters"/>
+    <w:qFormat/>
     <w:rPr>
       <w:vertAlign w:val="superscript"/>
     </w:rPr>

</xml_diff>